<commit_message>
Updating the deployment guide
Inserido um novo passo no guia, para a configuracao da variavel JAVA_HOME.
</commit_message>
<xml_diff>
--- a/3.Implementacao/0FUMO - Guia de Implantação.docx
+++ b/3.Implementacao/0FUMO - Guia de Implantação.docx
@@ -351,7 +351,18 @@
                                     <w:szCs w:val="32"/>
                                     <w:lang w:val="pt-PT"/>
                                   </w:rPr>
-                                  <w:t>Versão 0.0.1</w:t>
+                                  <w:t>Versão 0.0.</w:t>
+                                </w:r>
+                                <w:r>
+                                  <w:rPr>
+                                    <w:rFonts w:ascii="Segoe UI" w:hAnsi="Segoe UI" w:cs="Segoe UI"/>
+                                    <w:b w:val="0"/>
+                                    <w:color w:val="1D1B11" w:themeColor="background2" w:themeShade="1A"/>
+                                    <w:sz w:val="32"/>
+                                    <w:szCs w:val="32"/>
+                                    <w:lang w:val="pt-PT"/>
+                                  </w:rPr>
+                                  <w:t>2</w:t>
                                 </w:r>
                               </w:p>
                             </w:sdtContent>
@@ -440,7 +451,18 @@
                               <w:szCs w:val="32"/>
                               <w:lang w:val="pt-PT"/>
                             </w:rPr>
-                            <w:t>Versão 0.0.1</w:t>
+                            <w:t>Versão 0.0.</w:t>
+                          </w:r>
+                          <w:r>
+                            <w:rPr>
+                              <w:rFonts w:ascii="Segoe UI" w:hAnsi="Segoe UI" w:cs="Segoe UI"/>
+                              <w:b w:val="0"/>
+                              <w:color w:val="1D1B11" w:themeColor="background2" w:themeShade="1A"/>
+                              <w:sz w:val="32"/>
+                              <w:szCs w:val="32"/>
+                              <w:lang w:val="pt-PT"/>
+                            </w:rPr>
+                            <w:t>2</w:t>
                           </w:r>
                         </w:p>
                       </w:sdtContent>
@@ -912,7 +934,18 @@
           <w:p>
             <w:pPr>
               <w:jc w:val="left"/>
+              <w:rPr>
+                <w:i/>
+                <w:color w:val="0000FF"/>
+              </w:rPr>
             </w:pPr>
+            <w:r>
+              <w:rPr>
+                <w:i/>
+                <w:color w:val="0000FF"/>
+              </w:rPr>
+              <w:t>07/06/2026</w:t>
+            </w:r>
           </w:p>
         </w:tc>
         <w:tc>
@@ -922,7 +955,18 @@
           <w:p>
             <w:pPr>
               <w:jc w:val="left"/>
+              <w:rPr>
+                <w:i/>
+                <w:color w:val="0000FF"/>
+              </w:rPr>
             </w:pPr>
+            <w:r>
+              <w:rPr>
+                <w:i/>
+                <w:color w:val="0000FF"/>
+              </w:rPr>
+              <w:t>0.0.2</w:t>
+            </w:r>
           </w:p>
         </w:tc>
         <w:tc>
@@ -932,7 +976,18 @@
           <w:p>
             <w:pPr>
               <w:jc w:val="left"/>
+              <w:rPr>
+                <w:i/>
+                <w:color w:val="0000FF"/>
+              </w:rPr>
             </w:pPr>
+            <w:r>
+              <w:rPr>
+                <w:i/>
+                <w:color w:val="0000FF"/>
+              </w:rPr>
+              <w:t>Inserido o passo da configuração da variavel JAVA_HOME</w:t>
+            </w:r>
           </w:p>
         </w:tc>
         <w:tc>
@@ -942,7 +997,18 @@
           <w:p>
             <w:pPr>
               <w:jc w:val="left"/>
+              <w:rPr>
+                <w:i/>
+                <w:color w:val="0000FF"/>
+              </w:rPr>
             </w:pPr>
+            <w:r>
+              <w:rPr>
+                <w:i/>
+                <w:color w:val="0000FF"/>
+              </w:rPr>
+              <w:t>Mateus Zerbini</w:t>
+            </w:r>
           </w:p>
         </w:tc>
       </w:tr>
@@ -1038,7 +1104,7 @@
         </w:rPr>
         <w:fldChar w:fldCharType="separate"/>
       </w:r>
-      <w:hyperlink w:anchor="_Toc231649987" w:history="1">
+      <w:hyperlink w:anchor="_Toc231727394" w:history="1">
         <w:r>
           <w:rPr>
             <w:rStyle w:val="Hyperlink"/>
@@ -1061,7 +1127,7 @@
           <w:rPr>
             <w:webHidden/>
           </w:rPr>
-          <w:instrText xml:space="preserve"> PAGEREF _Toc231649987 \h </w:instrText>
+          <w:instrText xml:space="preserve"> PAGEREF _Toc231727394 \h </w:instrText>
         </w:r>
         <w:r>
           <w:rPr>
@@ -1101,7 +1167,7 @@
           <w14:ligatures w14:val="standardContextual"/>
         </w:rPr>
       </w:pPr>
-      <w:hyperlink w:anchor="_Toc231649988" w:history="1">
+      <w:hyperlink w:anchor="_Toc231727395" w:history="1">
         <w:r>
           <w:rPr>
             <w:rStyle w:val="Hyperlink"/>
@@ -1124,7 +1190,7 @@
           <w:rPr>
             <w:webHidden/>
           </w:rPr>
-          <w:instrText xml:space="preserve"> PAGEREF _Toc231649988 \h </w:instrText>
+          <w:instrText xml:space="preserve"> PAGEREF _Toc231727395 \h </w:instrText>
         </w:r>
         <w:r>
           <w:rPr>
@@ -1165,7 +1231,7 @@
           <w14:ligatures w14:val="standardContextual"/>
         </w:rPr>
       </w:pPr>
-      <w:hyperlink w:anchor="_Toc231649989" w:history="1">
+      <w:hyperlink w:anchor="_Toc231727396" w:history="1">
         <w:r>
           <w:rPr>
             <w:rStyle w:val="Hyperlink"/>
@@ -1188,7 +1254,7 @@
           <w:rPr>
             <w:webHidden/>
           </w:rPr>
-          <w:instrText xml:space="preserve"> PAGEREF _Toc231649989 \h </w:instrText>
+          <w:instrText xml:space="preserve"> PAGEREF _Toc231727396 \h </w:instrText>
         </w:r>
         <w:r>
           <w:rPr>
@@ -1228,7 +1294,7 @@
           <w14:ligatures w14:val="standardContextual"/>
         </w:rPr>
       </w:pPr>
-      <w:hyperlink w:anchor="_Toc231649990" w:history="1">
+      <w:hyperlink w:anchor="_Toc231727397" w:history="1">
         <w:r>
           <w:rPr>
             <w:rStyle w:val="Hyperlink"/>
@@ -1252,7 +1318,7 @@
           <w:rPr>
             <w:webHidden/>
           </w:rPr>
-          <w:instrText xml:space="preserve"> PAGEREF _Toc231649990 \h </w:instrText>
+          <w:instrText xml:space="preserve"> PAGEREF _Toc231727397 \h </w:instrText>
         </w:r>
         <w:r>
           <w:rPr>
@@ -1292,7 +1358,7 @@
           <w14:ligatures w14:val="standardContextual"/>
         </w:rPr>
       </w:pPr>
-      <w:hyperlink w:anchor="_Toc231649991" w:history="1">
+      <w:hyperlink w:anchor="_Toc231727398" w:history="1">
         <w:r>
           <w:rPr>
             <w:rStyle w:val="Hyperlink"/>
@@ -1316,7 +1382,7 @@
           <w:rPr>
             <w:webHidden/>
           </w:rPr>
-          <w:instrText xml:space="preserve"> PAGEREF _Toc231649991 \h </w:instrText>
+          <w:instrText xml:space="preserve"> PAGEREF _Toc231727398 \h </w:instrText>
         </w:r>
         <w:r>
           <w:rPr>
@@ -1357,7 +1423,7 @@
           <w14:ligatures w14:val="standardContextual"/>
         </w:rPr>
       </w:pPr>
-      <w:hyperlink w:anchor="_Toc231649992" w:history="1">
+      <w:hyperlink w:anchor="_Toc231727399" w:history="1">
         <w:r>
           <w:rPr>
             <w:rStyle w:val="Hyperlink"/>
@@ -1380,7 +1446,7 @@
           <w:rPr>
             <w:webHidden/>
           </w:rPr>
-          <w:instrText xml:space="preserve"> PAGEREF _Toc231649992 \h </w:instrText>
+          <w:instrText xml:space="preserve"> PAGEREF _Toc231727399 \h </w:instrText>
         </w:r>
         <w:r>
           <w:rPr>
@@ -1420,7 +1486,7 @@
           <w14:ligatures w14:val="standardContextual"/>
         </w:rPr>
       </w:pPr>
-      <w:hyperlink w:anchor="_Toc231649993" w:history="1">
+      <w:hyperlink w:anchor="_Toc231727400" w:history="1">
         <w:r>
           <w:rPr>
             <w:rStyle w:val="Hyperlink"/>
@@ -1444,7 +1510,7 @@
           <w:rPr>
             <w:webHidden/>
           </w:rPr>
-          <w:instrText xml:space="preserve"> PAGEREF _Toc231649993 \h </w:instrText>
+          <w:instrText xml:space="preserve"> PAGEREF _Toc231727400 \h </w:instrText>
         </w:r>
         <w:r>
           <w:rPr>
@@ -1484,7 +1550,7 @@
           <w14:ligatures w14:val="standardContextual"/>
         </w:rPr>
       </w:pPr>
-      <w:hyperlink w:anchor="_Toc231649994" w:history="1">
+      <w:hyperlink w:anchor="_Toc231727401" w:history="1">
         <w:r>
           <w:rPr>
             <w:rStyle w:val="Hyperlink"/>
@@ -1508,7 +1574,7 @@
           <w:rPr>
             <w:webHidden/>
           </w:rPr>
-          <w:instrText xml:space="preserve"> PAGEREF _Toc231649994 \h </w:instrText>
+          <w:instrText xml:space="preserve"> PAGEREF _Toc231727401 \h </w:instrText>
         </w:r>
         <w:r>
           <w:rPr>
@@ -1548,7 +1614,7 @@
           <w14:ligatures w14:val="standardContextual"/>
         </w:rPr>
       </w:pPr>
-      <w:hyperlink w:anchor="_Toc231649995" w:history="1">
+      <w:hyperlink w:anchor="_Toc231727402" w:history="1">
         <w:r>
           <w:rPr>
             <w:rStyle w:val="Hyperlink"/>
@@ -1572,7 +1638,7 @@
           <w:rPr>
             <w:webHidden/>
           </w:rPr>
-          <w:instrText xml:space="preserve"> PAGEREF _Toc231649995 \h </w:instrText>
+          <w:instrText xml:space="preserve"> PAGEREF _Toc231727402 \h </w:instrText>
         </w:r>
         <w:r>
           <w:rPr>
@@ -1612,7 +1678,7 @@
           <w14:ligatures w14:val="standardContextual"/>
         </w:rPr>
       </w:pPr>
-      <w:hyperlink w:anchor="_Toc231649996" w:history="1">
+      <w:hyperlink w:anchor="_Toc231727403" w:history="1">
         <w:r>
           <w:rPr>
             <w:rStyle w:val="Hyperlink"/>
@@ -1636,7 +1702,7 @@
           <w:rPr>
             <w:webHidden/>
           </w:rPr>
-          <w:instrText xml:space="preserve"> PAGEREF _Toc231649996 \h </w:instrText>
+          <w:instrText xml:space="preserve"> PAGEREF _Toc231727403 \h </w:instrText>
         </w:r>
         <w:r>
           <w:rPr>
@@ -1677,7 +1743,7 @@
           <w14:ligatures w14:val="standardContextual"/>
         </w:rPr>
       </w:pPr>
-      <w:hyperlink w:anchor="_Toc231649997" w:history="1">
+      <w:hyperlink w:anchor="_Toc231727404" w:history="1">
         <w:r>
           <w:rPr>
             <w:rStyle w:val="Hyperlink"/>
@@ -1700,7 +1766,7 @@
           <w:rPr>
             <w:webHidden/>
           </w:rPr>
-          <w:instrText xml:space="preserve"> PAGEREF _Toc231649997 \h </w:instrText>
+          <w:instrText xml:space="preserve"> PAGEREF _Toc231727404 \h </w:instrText>
         </w:r>
         <w:r>
           <w:rPr>
@@ -1741,7 +1807,7 @@
           <w14:ligatures w14:val="standardContextual"/>
         </w:rPr>
       </w:pPr>
-      <w:hyperlink w:anchor="_Toc231649998" w:history="1">
+      <w:hyperlink w:anchor="_Toc231727405" w:history="1">
         <w:r>
           <w:rPr>
             <w:rStyle w:val="Hyperlink"/>
@@ -1764,7 +1830,7 @@
           <w:rPr>
             <w:webHidden/>
           </w:rPr>
-          <w:instrText xml:space="preserve"> PAGEREF _Toc231649998 \h </w:instrText>
+          <w:instrText xml:space="preserve"> PAGEREF _Toc231727405 \h </w:instrText>
         </w:r>
         <w:r>
           <w:rPr>
@@ -1809,7 +1875,7 @@
         <w:br w:type="page"/>
       </w:r>
       <w:bookmarkStart w:id="0" w:name="_Toc104341857"/>
-      <w:bookmarkStart w:id="1" w:name="_Toc231649987"/>
+      <w:bookmarkStart w:id="1" w:name="_Toc231727394"/>
       <w:r>
         <w:lastRenderedPageBreak/>
         <w:t>Introdução</w:t>
@@ -1858,7 +1924,7 @@
         <w:ind w:left="0" w:firstLine="0"/>
       </w:pPr>
       <w:bookmarkStart w:id="2" w:name="_Toc104341861"/>
-      <w:bookmarkStart w:id="3" w:name="_Toc231649988"/>
+      <w:bookmarkStart w:id="3" w:name="_Toc231727395"/>
       <w:r>
         <w:t>Referências</w:t>
       </w:r>
@@ -1922,7 +1988,7 @@
         </w:numPr>
         <w:ind w:left="0" w:firstLine="0"/>
       </w:pPr>
-      <w:bookmarkStart w:id="4" w:name="_Toc231649989"/>
+      <w:bookmarkStart w:id="4" w:name="_Toc231727396"/>
       <w:r>
         <w:t>Planejamento de Implantação</w:t>
       </w:r>
@@ -1948,7 +2014,7 @@
           <w:lang w:val="pt-PT"/>
         </w:rPr>
       </w:pPr>
-      <w:bookmarkStart w:id="5" w:name="_Toc231649990"/>
+      <w:bookmarkStart w:id="5" w:name="_Toc231727397"/>
       <w:r>
         <w:rPr>
           <w:lang w:val="pt-PT"/>
@@ -1999,7 +2065,7 @@
           <w:lang w:val="pt-PT"/>
         </w:rPr>
       </w:pPr>
-      <w:bookmarkStart w:id="6" w:name="_Toc231649991"/>
+      <w:bookmarkStart w:id="6" w:name="_Toc231727398"/>
       <w:r>
         <w:rPr>
           <w:lang w:val="pt-PT"/>
@@ -2071,7 +2137,7 @@
         </w:numPr>
         <w:ind w:left="0" w:firstLine="0"/>
       </w:pPr>
-      <w:bookmarkStart w:id="7" w:name="_Toc231649992"/>
+      <w:bookmarkStart w:id="7" w:name="_Toc231727399"/>
       <w:r>
         <w:lastRenderedPageBreak/>
         <w:t>Recursos NECESSÁRIOS PARA IMPLANTAR O PRODUTO</w:t>
@@ -2098,7 +2164,7 @@
           <w:lang w:val="pt-PT"/>
         </w:rPr>
       </w:pPr>
-      <w:bookmarkStart w:id="8" w:name="_Toc231649993"/>
+      <w:bookmarkStart w:id="8" w:name="_Toc231727400"/>
       <w:r>
         <w:rPr>
           <w:lang w:val="pt-PT"/>
@@ -2135,7 +2201,7 @@
           <w:lang w:val="pt-PT"/>
         </w:rPr>
       </w:pPr>
-      <w:bookmarkStart w:id="9" w:name="_Toc231649994"/>
+      <w:bookmarkStart w:id="9" w:name="_Toc231727401"/>
       <w:r>
         <w:rPr>
           <w:lang w:val="pt-PT"/>
@@ -2173,13 +2239,7 @@
         <w:spacing w:after="40"/>
       </w:pPr>
       <w:r>
-        <w:t xml:space="preserve">–  Espaço em disco: </w:t>
-      </w:r>
-      <w:r>
-        <w:t>4</w:t>
-      </w:r>
-      <w:r>
-        <w:t xml:space="preserve"> GB livres (dependências do Maven e imagem Docker).</w:t>
+        <w:t>–  Espaço em disco: 2 GB livres (dependências do Maven e imagem Docker).</w:t>
       </w:r>
     </w:p>
     <w:p>
@@ -2202,7 +2262,7 @@
           <w:lang w:val="pt-PT"/>
         </w:rPr>
       </w:pPr>
-      <w:bookmarkStart w:id="10" w:name="_Toc231649995"/>
+      <w:bookmarkStart w:id="10" w:name="_Toc231727402"/>
       <w:r>
         <w:rPr>
           <w:lang w:val="pt-PT"/>
@@ -2295,7 +2355,7 @@
           <w:lang w:val="pt-PT"/>
         </w:rPr>
       </w:pPr>
-      <w:bookmarkStart w:id="11" w:name="_Toc231649996"/>
+      <w:bookmarkStart w:id="11" w:name="_Toc231727403"/>
       <w:r>
         <w:rPr>
           <w:lang w:val="pt-PT"/>
@@ -2322,7 +2382,7 @@
         </w:numPr>
         <w:ind w:left="0" w:firstLine="0"/>
       </w:pPr>
-      <w:bookmarkStart w:id="12" w:name="_Toc231649997"/>
+      <w:bookmarkStart w:id="12" w:name="_Toc231727404"/>
       <w:r>
         <w:t>ROTEIRO DE implantação</w:t>
       </w:r>
@@ -2409,6 +2469,174 @@
           <w:bCs/>
         </w:rPr>
         <w:lastRenderedPageBreak/>
+        <w:t>Passo 0.1 — Configurar a variável JAVA_HOME</w:t>
+      </w:r>
+    </w:p>
+    <w:p>
+      <w:pPr>
+        <w:spacing w:after="120"/>
+      </w:pPr>
+      <w:r>
+        <w:t>O Maven wrapper (mvnw) exige a variável de ambiente JAVA_HOME apontando para a pasta do JDK 21. Sem ela, o projeto falha ao iniciar (Passo 4). O java -version pode funcionar mesmo sem o JAVA_HOME, por isso é importante configurá-lo.</w:t>
+      </w:r>
+    </w:p>
+    <w:p>
+      <w:pPr>
+        <w:spacing w:after="40"/>
+      </w:pPr>
+      <w:r>
+        <w:rPr>
+          <w:b/>
+          <w:bCs/>
+        </w:rPr>
+        <w:t>Windows:</w:t>
+      </w:r>
+    </w:p>
+    <w:p>
+      <w:pPr>
+        <w:spacing w:after="40"/>
+      </w:pPr>
+      <w:r>
+        <w:t>1) Descubra o caminho do JDK (normalmente em uma destas pastas):</w:t>
+      </w:r>
+    </w:p>
+    <w:p>
+      <w:pPr>
+        <w:shd w:val="clear" w:color="auto" w:fill="F2F3F5"/>
+        <w:spacing w:after="40"/>
+      </w:pPr>
+      <w:r>
+        <w:rPr>
+          <w:rFonts w:ascii="Consolas" w:hAnsi="Consolas" w:cs="Consolas"/>
+          <w:sz w:val="18"/>
+          <w:szCs w:val="18"/>
+        </w:rPr>
+        <w:t>dir "C:\Program Files\Eclipse Adoptium"</w:t>
+      </w:r>
+    </w:p>
+    <w:p>
+      <w:pPr>
+        <w:shd w:val="clear" w:color="auto" w:fill="F2F3F5"/>
+        <w:spacing w:after="40"/>
+      </w:pPr>
+      <w:r>
+        <w:rPr>
+          <w:rFonts w:ascii="Consolas" w:hAnsi="Consolas" w:cs="Consolas"/>
+          <w:sz w:val="18"/>
+          <w:szCs w:val="18"/>
+        </w:rPr>
+        <w:t>dir "C:\Program Files\Java"</w:t>
+      </w:r>
+    </w:p>
+    <w:p>
+      <w:pPr>
+        <w:spacing w:after="40"/>
+      </w:pPr>
+      <w:r>
+        <w:t>2) Defina o JAVA_HOME (em CMD aberto como administrador), trocando pelo caminho real que apareceu:</w:t>
+      </w:r>
+    </w:p>
+    <w:p>
+      <w:pPr>
+        <w:shd w:val="clear" w:color="auto" w:fill="F2F3F5"/>
+        <w:spacing w:after="40"/>
+      </w:pPr>
+      <w:r>
+        <w:rPr>
+          <w:rFonts w:ascii="Consolas" w:hAnsi="Consolas" w:cs="Consolas"/>
+          <w:sz w:val="18"/>
+          <w:szCs w:val="18"/>
+        </w:rPr>
+        <w:t>setx JAVA_HOME "C:\Program Files\Eclipse Adoptium\jdk-21.0.5.11-hotspot" /M</w:t>
+      </w:r>
+    </w:p>
+    <w:p>
+      <w:pPr>
+        <w:spacing w:after="40"/>
+      </w:pPr>
+      <w:r>
+        <w:t>3) Feche e reabra o terminal e confirme:</w:t>
+      </w:r>
+    </w:p>
+    <w:p>
+      <w:pPr>
+        <w:shd w:val="clear" w:color="auto" w:fill="F2F3F5"/>
+        <w:spacing w:after="40"/>
+      </w:pPr>
+      <w:r>
+        <w:rPr>
+          <w:rFonts w:ascii="Consolas" w:hAnsi="Consolas" w:cs="Consolas"/>
+          <w:sz w:val="18"/>
+          <w:szCs w:val="18"/>
+        </w:rPr>
+        <w:t>echo %JAVA_HOME%</w:t>
+      </w:r>
+    </w:p>
+    <w:p>
+      <w:pPr>
+        <w:spacing w:after="80"/>
+      </w:pPr>
+      <w:r>
+        <w:t>Para configurar apenas na sessão atual (PowerShell), use: $env:JAVA_HOME = "&lt;caminho-do-jdk&gt;".</w:t>
+      </w:r>
+    </w:p>
+    <w:p>
+      <w:pPr>
+        <w:spacing w:after="40"/>
+      </w:pPr>
+      <w:r>
+        <w:rPr>
+          <w:b/>
+          <w:bCs/>
+        </w:rPr>
+        <w:t>Linux / macOS:</w:t>
+      </w:r>
+    </w:p>
+    <w:p>
+      <w:pPr>
+        <w:shd w:val="clear" w:color="auto" w:fill="F2F3F5"/>
+        <w:spacing w:after="40"/>
+      </w:pPr>
+      <w:r>
+        <w:rPr>
+          <w:rFonts w:ascii="Consolas" w:hAnsi="Consolas" w:cs="Consolas"/>
+          <w:sz w:val="18"/>
+          <w:szCs w:val="18"/>
+        </w:rPr>
+        <w:t>export JAVA_HOME=$(/usr/libexec/java_home -v 21)     # macOS</w:t>
+      </w:r>
+    </w:p>
+    <w:p>
+      <w:pPr>
+        <w:shd w:val="clear" w:color="auto" w:fill="F2F3F5"/>
+        <w:spacing w:after="40"/>
+      </w:pPr>
+      <w:r>
+        <w:rPr>
+          <w:rFonts w:ascii="Consolas" w:hAnsi="Consolas" w:cs="Consolas"/>
+          <w:sz w:val="18"/>
+          <w:szCs w:val="18"/>
+        </w:rPr>
+        <w:t>export JAVA_HOME=/usr/lib/jvm/java-21-openjdk        # Linux (ajuste o caminho)</w:t>
+      </w:r>
+    </w:p>
+    <w:p>
+      <w:pPr>
+        <w:spacing w:after="120"/>
+      </w:pPr>
+      <w:r>
+        <w:t>Para tornar permanente no Linux/macOS, adicione a linha export ao final do arquivo ~/.bashrc ou ~/.zshrc.</w:t>
+      </w:r>
+    </w:p>
+    <w:p>
+      <w:pPr>
+        <w:spacing w:before="160" w:after="60"/>
+      </w:pPr>
+      <w:r>
+        <w:rPr>
+          <w:b/>
+          <w:bCs/>
+        </w:rPr>
         <w:t>Passo 1 — Obter o código</w:t>
       </w:r>
     </w:p>
@@ -3070,6 +3298,7 @@
           <w:b/>
           <w:bCs/>
         </w:rPr>
+        <w:lastRenderedPageBreak/>
         <w:t>Passo 6 — Teste de fumaça (validação)</w:t>
       </w:r>
     </w:p>
@@ -3202,7 +3431,14 @@
         <w:spacing w:after="40"/>
       </w:pPr>
       <w:r>
-        <w:lastRenderedPageBreak/>
+        <w:t>–  Erro de JAVA_HOME ao executar o mvnw: a variável não está definida. Configure-a apontando para a pasta do JDK 21 (ver Passo 0.1).</w:t>
+      </w:r>
+    </w:p>
+    <w:p>
+      <w:pPr>
+        <w:spacing w:after="40"/>
+      </w:pPr>
+      <w:r>
         <w:t>–  "Connection refused" ao banco: o Docker não está rodando ou o container não subiu (verifique docker ps).</w:t>
       </w:r>
     </w:p>
@@ -3256,7 +3492,7 @@
         </w:numPr>
         <w:ind w:left="0" w:firstLine="0"/>
       </w:pPr>
-      <w:bookmarkStart w:id="13" w:name="_Toc231649998"/>
+      <w:bookmarkStart w:id="13" w:name="_Toc231727405"/>
       <w:r>
         <w:t>Treinamento e suporte</w:t>
       </w:r>
@@ -3543,7 +3779,7 @@
             </w:sdtPr>
             <w:sdtContent>
               <w:r>
-                <w:t>Versão 0.0.1</w:t>
+                <w:t>Versão 0.0.2</w:t>
               </w:r>
             </w:sdtContent>
           </w:sdt>
@@ -3773,7 +4009,7 @@
               <v:shape id="_x0000_i1025" type="#_x0000_t75" style="width:61.5pt;height:34.5pt">
                 <v:imagedata r:id="rId1" o:title=""/>
               </v:shape>
-              <o:OLEObject Type="Embed" ProgID="Word.Picture.8" ShapeID="_x0000_i1025" DrawAspect="Content" ObjectID="_1842262933" r:id="rId2"/>
+              <o:OLEObject Type="Embed" ProgID="Word.Picture.8" ShapeID="_x0000_i1025" DrawAspect="Content" ObjectID="_1842340135" r:id="rId2"/>
             </w:object>
           </w:r>
         </w:p>
@@ -5399,10 +5635,10 @@
   </w:compat>
   <w:rsids>
     <w:rsidRoot w:val="00E05AB8"/>
-    <w:rsid w:val="002D0D01"/>
+    <w:rsid w:val="0014621E"/>
+    <w:rsid w:val="003944DC"/>
     <w:rsid w:val="006F4B0B"/>
-    <w:rsid w:val="0097152D"/>
-    <w:rsid w:val="00C77F7D"/>
+    <w:rsid w:val="00CD63A8"/>
     <w:rsid w:val="00E05AB8"/>
   </w:rsids>
   <m:mathPr>

</xml_diff>